<commit_message>
Update agent metadata and refine product requirements documentation
Replit-Commit-Author: Agent
</commit_message>
<xml_diff>
--- a/deliverables/fine-line-level-maker-prd.docx
+++ b/deliverables/fine-line-level-maker-prd.docx
@@ -23,7 +23,7 @@
         <w:pStyle w:val="Normal"/>
       </w:pPr>
       <w:r>
-        <w:t xml:space="preserve">Version: 1.0</w:t>
+        <w:t xml:space="preserve">Version: 1.1</w:t>
       </w:r>
     </w:p>
     <w:p>
@@ -63,63 +63,63 @@
         <w:pStyle w:val="Normal"/>
       </w:pPr>
       <w:r>
-        <w:t xml:space="preserve">This document replaces and expands the supplied “Fine Line Level Maker” requirements. It preserves the requested workflow and adds a self-contained compatibility contract for The Fine Line game. It is not a request to modify or rebuild the existing game.</w:t>
-      </w:r>
-    </w:p>
-    <w:p>
-      <w:pPr>
-        <w:pStyle w:val="Heading2"/>
-      </w:pPr>
-      <w:r>
-        <w:t xml:space="preserve">Decision record</w:t>
-      </w:r>
-    </w:p>
-    <w:p>
-      <w:pPr>
-        <w:pStyle w:val="Bullet"/>
-      </w:pPr>
-      <w:r>
-        <w:t xml:space="preserve">• Confirmed by the owner: desktop/laptop editor only.</w:t>
-      </w:r>
-    </w:p>
-    <w:p>
-      <w:pPr>
-        <w:pStyle w:val="Bullet"/>
-      </w:pPr>
-      <w:r>
-        <w:t xml:space="preserve">• Confirmed by the owner: seven differences per level by default; editable per level.</w:t>
-      </w:r>
-    </w:p>
-    <w:p>
-      <w:pPr>
-        <w:pStyle w:val="Bullet"/>
-      </w:pPr>
-      <w:r>
-        <w:t xml:space="preserve">• Confirmed by the owner: AI automatically chooses an appropriate visible replacement; no per-edit instruction field is required.</w:t>
-      </w:r>
-    </w:p>
-    <w:p>
-      <w:pPr>
-        <w:pStyle w:val="Bullet"/>
-      </w:pPr>
-      <w:r>
-        <w:t xml:space="preserve">• Confirmed by the owner: use a verified available image model that meets the requirements; the original model names are not mandatory.</w:t>
-      </w:r>
-    </w:p>
-    <w:p>
-      <w:pPr>
-        <w:pStyle w:val="Bullet"/>
-      </w:pPr>
-      <w:r>
-        <w:t xml:space="preserve">• Proposed implementation defaults: one content manager, English editor interface, Unicode level titles, one level edited at a time, and manual ZIP transfer to the separate game project. These are assumptions, not additional confirmed preferences.</w:t>
-      </w:r>
-    </w:p>
-    <w:p>
-      <w:pPr>
-        <w:pStyle w:val="Bullet"/>
-      </w:pPr>
-      <w:r>
-        <w:t xml:space="preserve">• Initial revision: incorporates the original requirements, owner clarifications, inspection of the current game, and provider documentation reviewed on the date above.</w:t>
+        <w:t xml:space="preserve">This document defines the complete requirements for a standalone level generator, including its authoring workflow, AI editing, draft management, validation, and asset compatibility with The Fine Line game. The existing game must not be modified or rebuilt as part of this project.</w:t>
+      </w:r>
+    </w:p>
+    <w:p>
+      <w:pPr>
+        <w:pStyle w:val="Heading2"/>
+      </w:pPr>
+      <w:r>
+        <w:t xml:space="preserve">Product definition</w:t>
+      </w:r>
+    </w:p>
+    <w:p>
+      <w:pPr>
+        <w:pStyle w:val="Bullet"/>
+      </w:pPr>
+      <w:r>
+        <w:t xml:space="preserve">• Desktop/laptop editor only.</w:t>
+      </w:r>
+    </w:p>
+    <w:p>
+      <w:pPr>
+        <w:pStyle w:val="Bullet"/>
+      </w:pPr>
+      <w:r>
+        <w:t xml:space="preserve">• Seven differences per level by default; editable per level.</w:t>
+      </w:r>
+    </w:p>
+    <w:p>
+      <w:pPr>
+        <w:pStyle w:val="Bullet"/>
+      </w:pPr>
+      <w:r>
+        <w:t xml:space="preserve">• AI automatically chooses an appropriate visible replacement; no per-edit instruction field is required.</w:t>
+      </w:r>
+    </w:p>
+    <w:p>
+      <w:pPr>
+        <w:pStyle w:val="Bullet"/>
+      </w:pPr>
+      <w:r>
+        <w:t xml:space="preserve">• Use a verified available image model that meets the generation and editing requirements.</w:t>
+      </w:r>
+    </w:p>
+    <w:p>
+      <w:pPr>
+        <w:pStyle w:val="Bullet"/>
+      </w:pPr>
+      <w:r>
+        <w:t xml:space="preserve">• One content manager, English editor interface, Unicode level titles, and one level edited at a time.</w:t>
+      </w:r>
+    </w:p>
+    <w:p>
+      <w:pPr>
+        <w:pStyle w:val="Bullet"/>
+      </w:pPr>
+      <w:r>
+        <w:t xml:space="preserve">• Manual ZIP transfer of validated assets to the separate game project.</w:t>
       </w:r>
     </w:p>
     <w:p>
@@ -207,23 +207,23 @@
         <w:pStyle w:val="Heading1"/>
       </w:pPr>
       <w:r>
-        <w:t xml:space="preserve">2. Scope and essential additions</w:t>
-      </w:r>
-    </w:p>
-    <w:p>
-      <w:pPr>
-        <w:pStyle w:val="Heading2"/>
-      </w:pPr>
-      <w:r>
-        <w:t xml:space="preserve">Required by the source document</w:t>
-      </w:r>
-    </w:p>
-    <w:p>
-      <w:pPr>
-        <w:pStyle w:val="Bullet"/>
-      </w:pPr>
-      <w:r>
-        <w:t xml:space="preserve">• Hidden-by-default, editable generation prompt built from the supplied style.</w:t>
+        <w:t xml:space="preserve">2. Product scope</w:t>
+      </w:r>
+    </w:p>
+    <w:p>
+      <w:pPr>
+        <w:pStyle w:val="Heading2"/>
+      </w:pPr>
+      <w:r>
+        <w:t xml:space="preserve">Required functionality</w:t>
+      </w:r>
+    </w:p>
+    <w:p>
+      <w:pPr>
+        <w:pStyle w:val="Bullet"/>
+      </w:pPr>
+      <w:r>
+        <w:t xml:space="preserve">• Hidden-by-default, editable generation prompt built from the defined visual style.</w:t>
       </w:r>
     </w:p>
     <w:p>
@@ -280,6 +280,30 @@
       </w:pPr>
       <w:r>
         <w:t xml:space="preserve">• AI “Complete” to fill erased areas with stylistically appropriate changes.</w:t>
+      </w:r>
+    </w:p>
+    <w:p>
+      <w:pPr>
+        <w:pStyle w:val="Bullet"/>
+      </w:pPr>
+      <w:r>
+        <w:t xml:space="preserve">• Accept/reject/retry for AI results, preserving the last good version and making chargeable retries explicit.</w:t>
+      </w:r>
+    </w:p>
+    <w:p>
+      <w:pPr>
+        <w:pStyle w:val="Bullet"/>
+      </w:pPr>
+      <w:r>
+        <w:t xml:space="preserve">• Autosaved drafts and a level library containing generated candidates, in-progress work, completed levels, and multi-level export selection.</w:t>
+      </w:r>
+    </w:p>
+    <w:p>
+      <w:pPr>
+        <w:pStyle w:val="Bullet"/>
+      </w:pPr>
+      <w:r>
+        <w:t xml:space="preserve">• Game-size preview and export validation covering taps, zone count, small differences, and control-obscured regions.</w:t>
       </w:r>
     </w:p>
     <w:p>
@@ -322,133 +346,224 @@
     </w:p>
     <w:p>
       <w:pPr>
-        <w:pStyle w:val="Heading2"/>
-      </w:pPr>
-      <w:r>
-        <w:t xml:space="preserve">Only three additional product features are proposed as essential</w:t>
-      </w:r>
-    </w:p>
-    <w:p>
-      <w:pPr>
-        <w:pStyle w:val="Bullet"/>
-      </w:pPr>
-      <w:r>
-        <w:t xml:space="preserve">1. </w:t>
+        <w:pStyle w:val="Bullet"/>
+      </w:pPr>
+      <w:r>
+        <w:t xml:space="preserve">• Game-ready single- and multi-level ZIP exports with safe manifest merging.</w:t>
+      </w:r>
+    </w:p>
+    <w:p>
+      <w:pPr>
+        <w:pStyle w:val="Bullet"/>
+      </w:pPr>
+      <w:r>
+        <w:t xml:space="preserve">• Separate editing and game masks, exact pixel preservation outside approved regions, protected access, and recoverable generation jobs.</w:t>
+      </w:r>
+    </w:p>
+    <w:p>
+      <w:pPr>
+        <w:pStyle w:val="Heading2"/>
+      </w:pPr>
+      <w:r>
+        <w:t xml:space="preserve">Non-goals</w:t>
+      </w:r>
+    </w:p>
+    <w:p>
+      <w:pPr>
+        <w:pStyle w:val="Bullet"/>
+      </w:pPr>
+      <w:r>
+        <w:t xml:space="preserve">• No mobile/tablet authoring, native app, or phone-rotation component.</w:t>
+      </w:r>
+    </w:p>
+    <w:p>
+      <w:pPr>
+        <w:pStyle w:val="Bullet"/>
+      </w:pPr>
+      <w:r>
+        <w:t xml:space="preserve">• No changes to the existing game, its scoring, hints, orientation behavior, or deployment.</w:t>
+      </w:r>
+    </w:p>
+    <w:p>
+      <w:pPr>
+        <w:pStyle w:val="Bullet"/>
+      </w:pPr>
+      <w:r>
+        <w:t xml:space="preserve">• No direct publishing into the game project, shared database, or cross-project API.</w:t>
+      </w:r>
+    </w:p>
+    <w:p>
+      <w:pPr>
+        <w:pStyle w:val="Bullet"/>
+      </w:pPr>
+      <w:r>
+        <w:t xml:space="preserve">• No unattended generation of finished levels: humans choose every edit region and approve every result.</w:t>
+      </w:r>
+    </w:p>
+    <w:p>
+      <w:pPr>
+        <w:pStyle w:val="Bullet"/>
+      </w:pPr>
+      <w:r>
+        <w:t xml:space="preserve">• No full layer editor, arbitrary drawing tools, text placement, or general image manipulation suite.</w:t>
+      </w:r>
+    </w:p>
+    <w:p>
+      <w:pPr>
+        <w:pStyle w:val="Bullet"/>
+      </w:pPr>
+      <w:r>
+        <w:t xml:space="preserve">• No teams, roles beyond an authorized manager, public gallery, marketplace, payments, analytics dashboard, or difficulty-ranking system.</w:t>
+      </w:r>
+    </w:p>
+    <w:p>
+      <w:pPr>
+        <w:pStyle w:val="Bullet"/>
+      </w:pPr>
+      <w:r>
+        <w:t xml:space="preserve">• No import of arbitrary images or legacy editable projects in the first version. Importing an existing game manifest for safe export merging is included.</w:t>
+      </w:r>
+    </w:p>
+    <w:p>
+      <w:pPr>
+        <w:pStyle w:val="Heading1"/>
+      </w:pPr>
+      <w:r>
+        <w:t xml:space="preserve">3. End-to-end workflow</w:t>
+      </w:r>
+    </w:p>
+    <w:p>
+      <w:pPr>
+        <w:pStyle w:val="Bullet"/>
+      </w:pPr>
+      <w:r>
+        <w:t xml:space="preserve">1. Open the generator and press </w:t>
       </w:r>
       <w:r>
         <w:rPr>
           <w:b/>
         </w:rPr>
-        <w:t xml:space="preserve">Autosaved drafts and a minimal level library.</w:t>
-      </w:r>
-      <w:r>
-        <w:t xml:space="preserve"> Keep generated candidates, in-progress work, completed levels, and a multi-level export selection. Without this, creating multiple levels efficiently is fragile.</w:t>
-      </w:r>
-    </w:p>
-    <w:p>
-      <w:pPr>
-        <w:pStyle w:val="Bullet"/>
-      </w:pPr>
-      <w:r>
-        <w:t xml:space="preserve">2. </w:t>
+        <w:t xml:space="preserve">Generate</w:t>
+      </w:r>
+      <w:r>
+        <w:t xml:space="preserve">. The app creates four varied scene prompts using the fixed style; the prompt area stays collapsed unless expanded.</w:t>
+      </w:r>
+    </w:p>
+    <w:p>
+      <w:pPr>
+        <w:pStyle w:val="Bullet"/>
+      </w:pPr>
+      <w:r>
+        <w:t xml:space="preserve">2. View four 512px candidate previews as they finish. Retain all successful candidates in the library.</w:t>
+      </w:r>
+    </w:p>
+    <w:p>
+      <w:pPr>
+        <w:pStyle w:val="Bullet"/>
+      </w:pPr>
+      <w:r>
+        <w:t xml:space="preserve">3. Press </w:t>
       </w:r>
       <w:r>
         <w:rPr>
           <w:b/>
         </w:rPr>
-        <w:t xml:space="preserve">Game-size preview and export validation.</w:t>
-      </w:r>
-      <w:r>
-        <w:t xml:space="preserve"> Test taps, zone count, small differences, and control-obscured regions before publishing assets to the game.</w:t>
-      </w:r>
-    </w:p>
-    <w:p>
-      <w:pPr>
-        <w:pStyle w:val="Bullet"/>
-      </w:pPr>
-      <w:r>
-        <w:t xml:space="preserve">3. </w:t>
+        <w:t xml:space="preserve">Edit</w:t>
+      </w:r>
+      <w:r>
+        <w:t xml:space="preserve"> on a candidate to create or reopen its level draft in a separate editor window.</w:t>
+      </w:r>
+    </w:p>
+    <w:p>
+      <w:pPr>
+        <w:pStyle w:val="Bullet"/>
+      </w:pPr>
+      <w:r>
+        <w:t xml:space="preserve">4. Review the original at right. Erase a connected region on the left where a difference should appear.</w:t>
+      </w:r>
+    </w:p>
+    <w:p>
+      <w:pPr>
+        <w:pStyle w:val="Bullet"/>
+      </w:pPr>
+      <w:r>
+        <w:t xml:space="preserve">5. Press </w:t>
       </w:r>
       <w:r>
         <w:rPr>
           <w:b/>
         </w:rPr>
-        <w:t xml:space="preserve">Accept/reject/retry for AI results.</w:t>
-      </w:r>
-      <w:r>
-        <w:t xml:space="preserve"> A generated edit is a proposal, not an automatic overwrite. Preserve the last good version and make chargeable retries explicit.</w:t>
-      </w:r>
-    </w:p>
-    <w:p>
-      <w:pPr>
-        <w:pStyle w:val="Normal"/>
-      </w:pPr>
-      <w:r>
-        <w:t xml:space="preserve">Game-ready packaging, mask separation, pixel compositing, access protection, and job recovery below are correctness requirements supporting these features—not separate expanded modules.</w:t>
-      </w:r>
-    </w:p>
-    <w:p>
-      <w:pPr>
-        <w:pStyle w:val="Heading2"/>
-      </w:pPr>
-      <w:r>
-        <w:t xml:space="preserve">Non-goals</w:t>
-      </w:r>
-    </w:p>
-    <w:p>
-      <w:pPr>
-        <w:pStyle w:val="Bullet"/>
-      </w:pPr>
-      <w:r>
-        <w:t xml:space="preserve">• No mobile/tablet authoring, native app, or phone-rotation component.</w:t>
-      </w:r>
-    </w:p>
-    <w:p>
-      <w:pPr>
-        <w:pStyle w:val="Bullet"/>
-      </w:pPr>
-      <w:r>
-        <w:t xml:space="preserve">• No changes to the existing game, its scoring, hints, orientation behavior, or deployment.</w:t>
-      </w:r>
-    </w:p>
-    <w:p>
-      <w:pPr>
-        <w:pStyle w:val="Bullet"/>
-      </w:pPr>
-      <w:r>
-        <w:t xml:space="preserve">• No direct publishing into the game project, shared database, or cross-project API.</w:t>
-      </w:r>
-    </w:p>
-    <w:p>
-      <w:pPr>
-        <w:pStyle w:val="Bullet"/>
-      </w:pPr>
-      <w:r>
-        <w:t xml:space="preserve">• No unattended generation of finished levels: humans choose every edit region and approve every result.</w:t>
-      </w:r>
-    </w:p>
-    <w:p>
-      <w:pPr>
-        <w:pStyle w:val="Bullet"/>
-      </w:pPr>
-      <w:r>
-        <w:t xml:space="preserve">• No full layer editor, arbitrary drawing tools, text placement, or general image manipulation suite.</w:t>
-      </w:r>
-    </w:p>
-    <w:p>
-      <w:pPr>
-        <w:pStyle w:val="Bullet"/>
-      </w:pPr>
-      <w:r>
-        <w:t xml:space="preserve">• No teams, roles beyond an authorized manager, public gallery, marketplace, payments, analytics dashboard, or difficulty-ranking system.</w:t>
-      </w:r>
-    </w:p>
-    <w:p>
-      <w:pPr>
-        <w:pStyle w:val="Bullet"/>
-      </w:pPr>
-      <w:r>
-        <w:t xml:space="preserve">• No import of arbitrary images or legacy editable projects in the first version. Importing an existing game manifest for safe export merging is included.</w:t>
+        <w:t xml:space="preserve">Complete</w:t>
+      </w:r>
+      <w:r>
+        <w:t xml:space="preserve">. AI proposes a visible, coherent change within the selected region.</w:t>
+      </w:r>
+    </w:p>
+    <w:p>
+      <w:pPr>
+        <w:pStyle w:val="Bullet"/>
+      </w:pPr>
+      <w:r>
+        <w:t xml:space="preserve">6. Review the proposal, then </w:t>
+      </w:r>
+      <w:r>
+        <w:rPr>
+          <w:b/>
+        </w:rPr>
+        <w:t xml:space="preserve">Accept</w:t>
+      </w:r>
+      <w:r>
+        <w:t xml:space="preserve">, </w:t>
+      </w:r>
+      <w:r>
+        <w:rPr>
+          <w:b/>
+        </w:rPr>
+        <w:t xml:space="preserve">Reject</w:t>
+      </w:r>
+      <w:r>
+        <w:t xml:space="preserve">, or </w:t>
+      </w:r>
+      <w:r>
+        <w:rPr>
+          <w:b/>
+        </w:rPr>
+        <w:t xml:space="preserve">Retry</w:t>
+      </w:r>
+      <w:r>
+        <w:t xml:space="preserve">. Repeat until the target number of differences is achieved.</w:t>
+      </w:r>
+    </w:p>
+    <w:p>
+      <w:pPr>
+        <w:pStyle w:val="Bullet"/>
+      </w:pPr>
+      <w:r>
+        <w:t xml:space="preserve">7. Inspect the cumulative hitmap and test the level at game size.</w:t>
+      </w:r>
+    </w:p>
+    <w:p>
+      <w:pPr>
+        <w:pStyle w:val="Bullet"/>
+      </w:pPr>
+      <w:r>
+        <w:t xml:space="preserve">8. Save the level and download the descriptively named PNGs or the game-ready ZIP.</w:t>
+      </w:r>
+    </w:p>
+    <w:p>
+      <w:pPr>
+        <w:pStyle w:val="Bullet"/>
+      </w:pPr>
+      <w:r>
+        <w:t xml:space="preserve">9. Return to the library, edit more candidates, and export multiple approved levels in one ZIP.</w:t>
+      </w:r>
+    </w:p>
+    <w:p>
+      <w:pPr>
+        <w:pStyle w:val="Normal"/>
+      </w:pPr>
+      <w:r>
+        <w:t xml:space="preserve">The manager can erase several separate regions before Complete, but editing one difference at a time is the recommended workflow for easier review.</w:t>
       </w:r>
     </w:p>
     <w:p>
@@ -456,148 +571,6 @@
         <w:pStyle w:val="Heading1"/>
       </w:pPr>
       <w:r>
-        <w:t xml:space="preserve">3. End-to-end workflow</w:t>
-      </w:r>
-    </w:p>
-    <w:p>
-      <w:pPr>
-        <w:pStyle w:val="Bullet"/>
-      </w:pPr>
-      <w:r>
-        <w:t xml:space="preserve">1. Open the generator and press </w:t>
-      </w:r>
-      <w:r>
-        <w:rPr>
-          <w:b/>
-        </w:rPr>
-        <w:t xml:space="preserve">Generate</w:t>
-      </w:r>
-      <w:r>
-        <w:t xml:space="preserve">. The app creates four varied scene prompts using the fixed style; the prompt area stays collapsed unless expanded.</w:t>
-      </w:r>
-    </w:p>
-    <w:p>
-      <w:pPr>
-        <w:pStyle w:val="Bullet"/>
-      </w:pPr>
-      <w:r>
-        <w:t xml:space="preserve">2. View four 512px candidate previews as they finish. Retain all successful candidates in the library.</w:t>
-      </w:r>
-    </w:p>
-    <w:p>
-      <w:pPr>
-        <w:pStyle w:val="Bullet"/>
-      </w:pPr>
-      <w:r>
-        <w:t xml:space="preserve">3. Press </w:t>
-      </w:r>
-      <w:r>
-        <w:rPr>
-          <w:b/>
-        </w:rPr>
-        <w:t xml:space="preserve">Edit</w:t>
-      </w:r>
-      <w:r>
-        <w:t xml:space="preserve"> on a candidate to create or reopen its level draft in a separate editor window.</w:t>
-      </w:r>
-    </w:p>
-    <w:p>
-      <w:pPr>
-        <w:pStyle w:val="Bullet"/>
-      </w:pPr>
-      <w:r>
-        <w:t xml:space="preserve">4. Review the original at right. Erase a connected region on the left where a difference should appear.</w:t>
-      </w:r>
-    </w:p>
-    <w:p>
-      <w:pPr>
-        <w:pStyle w:val="Bullet"/>
-      </w:pPr>
-      <w:r>
-        <w:t xml:space="preserve">5. Press </w:t>
-      </w:r>
-      <w:r>
-        <w:rPr>
-          <w:b/>
-        </w:rPr>
-        <w:t xml:space="preserve">Complete</w:t>
-      </w:r>
-      <w:r>
-        <w:t xml:space="preserve">. AI proposes a visible, coherent change within the selected region.</w:t>
-      </w:r>
-    </w:p>
-    <w:p>
-      <w:pPr>
-        <w:pStyle w:val="Bullet"/>
-      </w:pPr>
-      <w:r>
-        <w:t xml:space="preserve">6. Review the proposal, then </w:t>
-      </w:r>
-      <w:r>
-        <w:rPr>
-          <w:b/>
-        </w:rPr>
-        <w:t xml:space="preserve">Accept</w:t>
-      </w:r>
-      <w:r>
-        <w:t xml:space="preserve">, </w:t>
-      </w:r>
-      <w:r>
-        <w:rPr>
-          <w:b/>
-        </w:rPr>
-        <w:t xml:space="preserve">Reject</w:t>
-      </w:r>
-      <w:r>
-        <w:t xml:space="preserve">, or </w:t>
-      </w:r>
-      <w:r>
-        <w:rPr>
-          <w:b/>
-        </w:rPr>
-        <w:t xml:space="preserve">Retry</w:t>
-      </w:r>
-      <w:r>
-        <w:t xml:space="preserve">. Repeat until the target number of differences is achieved.</w:t>
-      </w:r>
-    </w:p>
-    <w:p>
-      <w:pPr>
-        <w:pStyle w:val="Bullet"/>
-      </w:pPr>
-      <w:r>
-        <w:t xml:space="preserve">7. Inspect the cumulative hitmap and test the level at game size.</w:t>
-      </w:r>
-    </w:p>
-    <w:p>
-      <w:pPr>
-        <w:pStyle w:val="Bullet"/>
-      </w:pPr>
-      <w:r>
-        <w:t xml:space="preserve">8. Save the level and download the descriptively named PNGs or the game-ready ZIP.</w:t>
-      </w:r>
-    </w:p>
-    <w:p>
-      <w:pPr>
-        <w:pStyle w:val="Bullet"/>
-      </w:pPr>
-      <w:r>
-        <w:t xml:space="preserve">9. Return to the library, edit more candidates, and export multiple approved levels in one ZIP.</w:t>
-      </w:r>
-    </w:p>
-    <w:p>
-      <w:pPr>
-        <w:pStyle w:val="Normal"/>
-      </w:pPr>
-      <w:r>
-        <w:t xml:space="preserve">The manager can erase several separate regions before Complete, but editing one difference at a time is the recommended workflow for easier review.</w:t>
-      </w:r>
-    </w:p>
-    <w:p>
-      <w:pPr>
-        <w:pStyle w:val="Heading1"/>
-      </w:pPr>
-      <w:r>
         <w:t xml:space="preserve">4. Image generation and prompts</w:t>
       </w:r>
     </w:p>
@@ -710,7 +683,7 @@
         <w:pStyle w:val="Normal"/>
       </w:pPr>
       <w:r>
-        <w:t xml:space="preserve">Use the following supplied style as the base, adapting syntax to the selected provider:</w:t>
+        <w:t xml:space="preserve">Use the following visual style as the base, adapting syntax to the selected provider:</w:t>
       </w:r>
     </w:p>
     <w:p>
@@ -726,7 +699,7 @@
         <w:pStyle w:val="Normal"/>
       </w:pPr>
       <w:r>
-        <w:t xml:space="preserve">Add game-specific directions:</w:t>
+        <w:t xml:space="preserve">Every generation prompt must also satisfy these game-specific requirements:</w:t>
       </w:r>
     </w:p>
     <w:p>
@@ -1729,7 +1702,7 @@
         <w:pStyle w:val="Bullet"/>
       </w:pPr>
       <w:r>
-        <w:t xml:space="preserve">• Suggested states: Candidate → Draft → Ready → Exported. A new edit to a ready/exported level returns it to Draft.</w:t>
+        <w:t xml:space="preserve">• Lifecycle states: Candidate → Draft → Ready → Exported. A new edit to a ready/exported level returns it to Draft.</w:t>
       </w:r>
     </w:p>
     <w:p>
@@ -2128,7 +2101,7 @@
         <w:pStyle w:val="Normal"/>
       </w:pPr>
       <w:r>
-        <w:t xml:space="preserve">Recommended starting option: </w:t>
+        <w:t xml:space="preserve">Start by qualifying </w:t>
       </w:r>
       <w:r>
         <w:rPr>
@@ -2137,15 +2110,15 @@
         <w:t xml:space="preserve">OpenAI `gpt-image-2` through Replit AI Integrations</w:t>
       </w:r>
       <w:r>
-        <w:t xml:space="preserve">, subject to testing the actual route in the new project.</w:t>
-      </w:r>
-    </w:p>
-    <w:p>
-      <w:pPr>
-        <w:pStyle w:val="Normal"/>
-      </w:pPr>
-      <w:r>
-        <w:t xml:space="preserve">Rationale: Replit's published list includes </w:t>
+        <w:t xml:space="preserve"> using the capability checks below.</w:t>
+      </w:r>
+    </w:p>
+    <w:p>
+      <w:pPr>
+        <w:pStyle w:val="Normal"/>
+      </w:pPr>
+      <w:r>
+        <w:t xml:space="preserve">Replit's published list includes </w:t>
       </w:r>
       <w:r>
         <w:rPr>
@@ -2155,15 +2128,15 @@
         <w:t xml:space="preserve">gpt-image-2</w:t>
       </w:r>
       <w:r>
-        <w:t xml:space="preserve"> [S2], and OpenAI documents 2048 × 2048 output and image editing for it [S1, S3]. This recommendation is based on documentation, not an executed integration test.</w:t>
-      </w:r>
-    </w:p>
-    <w:p>
-      <w:pPr>
-        <w:pStyle w:val="Normal"/>
-      </w:pPr>
-      <w:r>
-        <w:t xml:space="preserve">OpenAI also documents the original names </w:t>
+        <w:t xml:space="preserve"> [S2], and OpenAI documents 2048 × 2048 output and image editing for it [S1, S3]. This starting choice is based on documentation, not an executed integration test.</w:t>
+      </w:r>
+    </w:p>
+    <w:p>
+      <w:pPr>
+        <w:pStyle w:val="Normal"/>
+      </w:pPr>
+      <w:r>
+        <w:t xml:space="preserve">OpenAI also documents </w:t>
       </w:r>
       <w:r>
         <w:rPr>
@@ -2183,7 +2156,7 @@
         <w:t xml:space="preserve">gpt-image-2.5-flare</w:t>
       </w:r>
       <w:r>
-        <w:t xml:space="preserve">, recommending Sunburst where editing precision matters and Flare for faster general generation [S1]. Their availability through the selected Replit integration has not been established. They are permitted alternatives, not mandatory IDs.</w:t>
+        <w:t xml:space="preserve">, recommending Sunburst where editing precision matters and Flare for faster general generation [S1]. Their availability through the selected Replit integration has not been established. They are permitted alternatives if they pass the same capability checks.</w:t>
       </w:r>
     </w:p>
     <w:p>
@@ -2255,7 +2228,7 @@
         <w:pStyle w:val="Heading2"/>
       </w:pPr>
       <w:r>
-        <w:t xml:space="preserve">TECH-01 — Suggested architecture for a separate Replit project</w:t>
+        <w:t xml:space="preserve">TECH-01 — Architecture for a separate Replit project</w:t>
       </w:r>
     </w:p>
     <w:p>
@@ -2319,7 +2292,7 @@
         <w:pStyle w:val="Bullet"/>
       </w:pPr>
       <w:r>
-        <w:t xml:space="preserve">• These are requirements for the new project only. Do not provision services or change the game while preparing this PRD.</w:t>
+        <w:t xml:space="preserve">• Provision these services only in the new generator project. Do not change the existing game project.</w:t>
       </w:r>
     </w:p>
     <w:p>
@@ -2671,15 +2644,15 @@
         <w:pStyle w:val="Normal"/>
       </w:pPr>
       <w:r>
-        <w:t xml:space="preserve">No additional product clarification is required to write this PRD. Before implementation is finalized, confirm the actual integration's model and mask support, native 2048px reliability, cost/rate limits, access-control setup, and an appropriate browser memory strategy.</w:t>
-      </w:r>
-    </w:p>
-    <w:p>
-      <w:pPr>
-        <w:pStyle w:val="Normal"/>
-      </w:pPr>
-      <w:r>
-        <w:t xml:space="preserve">The product assumptions in the decision record remain reviewable. Do not turn them into new features or silently relax the asset contract.</w:t>
+        <w:t xml:space="preserve">Before implementation is finalized, verify the actual integration's model and mask support, native 2048px reliability, cost/rate limits, access-control setup, and an appropriate browser memory strategy.</w:t>
+      </w:r>
+    </w:p>
+    <w:p>
+      <w:pPr>
+        <w:pStyle w:val="Normal"/>
+      </w:pPr>
+      <w:r>
+        <w:t xml:space="preserve">Resolve implementation limitations without expanding product scope or silently relaxing the asset contract.</w:t>
       </w:r>
     </w:p>
     <w:p>
@@ -2688,23 +2661,6 @@
       </w:pPr>
       <w:r>
         <w:t xml:space="preserve">15. Sources and evidence</w:t>
-      </w:r>
-    </w:p>
-    <w:p>
-      <w:pPr>
-        <w:pStyle w:val="Bullet"/>
-      </w:pPr>
-      <w:r>
-        <w:t xml:space="preserve">• </w:t>
-      </w:r>
-      <w:r>
-        <w:rPr>
-          <w:b/>
-        </w:rPr>
-        <w:t xml:space="preserve">Owner source:</w:t>
-      </w:r>
-      <w:r>
-        <w:t xml:space="preserve"> “Fine Line Level Maker” DOCX and the four clarification answers.</w:t>
       </w:r>
     </w:p>
     <w:p>
@@ -2920,7 +2876,7 @@
         <w:sz w:val="16"/>
         <w:color w:val="64748B"/>
       </w:rPr>
-      <w:t>THE FINE LINE / LEVEL MAKER / PRD 1.0</w:t>
+      <w:t>THE FINE LINE / LEVEL MAKER / PRD 1.1</w:t>
     </w:r>
   </w:p>
 </w:hdr>

</xml_diff>